<commit_message>
Revise exposition voice and monastic attribution across six languages and downloads
</commit_message>
<xml_diff>
--- a/docs/exposition/downloads/CTM_analysis_de.docx
+++ b/docs/exposition/downloads/CTM_analysis_de.docx
@@ -380,10 +380,7 @@
     </w:p>
     <w:p>
       <w:r>
-        <w:rPr>
-          <w:b w:val="0"/>
-        </w:rPr>
-        <w:t>Die wichtigste Leistung des Projekts sehe ich in der Verbindung dreier Fragen, die sich leicht getrennt behandeln lassen: Woraus lebt der Mensch, kann er selbst antworten, und welche gesellschaftlichen Bedingungen ermöglichen eine solche Antwort? Die größte Schwierigkeit liegt in der Begründung der Übergänge zwischen diesen Fragen. Von der Unmöglichkeit absoluter Selbstbegründung zum persönlichen Gott ist ein eigener Übergang erforderlich; die strukturelle Analogie zur Trinität bedarf der Prüfung; eine überzeugende Diagnose menschlicher Praxis ist kein Beweis für das Heil.</w:t>
+        <w:t>Eine wesentliche Leistung des Projekts besteht in der Verbindung dreier Fragen, die häufig getrennt behandelt werden: Woraus lebt der Mensch, kann er zum Autor seiner eigenen Antwort werden, und welche gesellschaftlichen Bedingungen ermöglichen eine solche Antwort? Die größte Schwierigkeit liegt in der Begründung der Übergänge zwischen diesen Fragen. Von der Unmöglichkeit absoluter Selbstbegründung zum persönlichen Gott ist ein eigener Übergang erforderlich; die strukturelle Analogie zur Trinität bedarf der Prüfung; eine überzeugende Diagnose menschlicher Praxis ist kein Beweis für das Heil.</w:t>
       </w:r>
     </w:p>
     <w:p>
@@ -528,10 +525,7 @@
     </w:p>
     <w:p>
       <w:r>
-        <w:rPr>
-          <w:b w:val="0"/>
-        </w:rPr>
-        <w:t>Dies erweitert die Wahrheitsfrage, hebt die Genauigkeit von Aussagen aber nicht auf. Sind die Tatsachen falsch, kann die Bereitschaft, „nach der Wahrheit“ zu leben, lediglich die konsequente Befolgung eines Irrtums bedeuten. Eine starke Lesart von CTM verbindet deshalb die Überprüfbarkeit von Urteilen mit der existenziellen Bereitschaft, ihre Folgen anzunehmen. Im III. Band wird diese Verbindung durch die Forderung geschützt, Tatsache, Interpretation, Norm, Projekt und Prognose zu unterscheiden.</w:t>
+        <w:t>Dies erweitert die Wahrheitsfrage, hebt die Genauigkeit von Aussagen aber nicht auf. Sind die Tatsachen falsch, kann die Bereitschaft, „nach der Wahrheit“ zu leben, lediglich die konsequente Befolgung eines Irrtums bedeuten. In der hier vorgeschlagenen Interpretation verbindet CTM deshalb die Überprüfbarkeit von Urteilen mit der existenziellen Bereitschaft, ihre Folgen anzunehmen. Im III. Band wird diese Verbindung durch die Forderung geschützt, Tatsache, Interpretation, Norm, Projekt und Prognose zu unterscheiden.</w:t>
       </w:r>
     </w:p>
     <w:p>
@@ -944,10 +938,7 @@
     </w:p>
     <w:p>
       <w:r>
-        <w:rPr>
-          <w:b w:val="0"/>
-        </w:rPr>
-        <w:t>Sich selbst anzunehmen bedeutet in diesem Prozess keine Selbstzufriedenheit. Der Mensch nimmt den Träger seiner Geschichte an, um sie fortsetzen und verändern zu können. Identität entsteht als Kontinuität der Antwort: Auch wenn ich mich verändere, kann ich eine frühere Tat als meine anerkennen, ihre Folgen korrigieren und die Vergangenheit nicht einem fremden Menschen zuschreiben, der ich angeblich früher gewesen sei.</w:t>
+        <w:t>Sich selbst anzunehmen bedeutet in diesem Prozess keine Selbstzufriedenheit. Der Mensch nimmt den Träger seiner Geschichte an, um sie fortsetzen und verändern zu können. Identität entsteht als Kontinuität der Antwort: Auch im Wandel kann der Mensch eine frühere Tat als seine eigene anerkennen, ihre Folgen korrigieren und darauf verzichten, die Vergangenheit einem fremden Menschen zuzuschreiben, der er angeblich früher gewesen sei.</w:t>
       </w:r>
     </w:p>
     <w:p>
@@ -1212,10 +1203,7 @@
     </w:p>
     <w:p>
       <w:r>
-        <w:rPr>
-          <w:b w:val="0"/>
-        </w:rPr>
-        <w:t>Eine der gehaltvollsten Formulierungen des II. Bandes unterscheidet zwischen der Absolutheit Gottes und der absoluten Bedeutsamkeit der Person für Gott. Der Mensch ist endlich und geschaffen. Seine Endlichkeit bedeutet aber nicht, dass er ersetzbar wäre oder einem unpersönlichen Ganzen als Verbrauchsmaterial geopfert werden dürfte.</w:t>
+        <w:t>Im II. Band wird unterschieden zwischen der Absolutheit Gottes und der absoluten Bedeutsamkeit der Person für Gott. Der Mensch ist endlich und geschaffen. Seine Endlichkeit bedeutet aber nicht, dass er ersetzbar wäre oder einem unpersönlichen Ganzen als Verbrauchsmaterial geopfert werden dürfte.</w:t>
       </w:r>
     </w:p>
     <w:p>
@@ -1228,10 +1216,7 @@
     </w:p>
     <w:p>
       <w:r>
-        <w:rPr>
-          <w:b w:val="0"/>
-        </w:rPr>
-        <w:t>Hier bietet CTM eine starke theologische Begründung der Unersetzlichkeit. Die Behauptung, keine andere philosophische Begründung der Unersetzlichkeit sei möglich, wäre jedoch eine eigene, weiterreichende These. Dafür genügt es nicht, die Stärke der christlichen Lösung zu zeigen; konkurrierende Argumente müssten untersucht werden. [II, „Eschatologische Subjekthaftigkeit“, §§11–12.]</w:t>
+        <w:t>Im Rahmen seiner christlichen Voraussetzungen bietet CTM hier eine theologische Begründung der Unersetzlichkeit. Die Behauptung, keine andere philosophische Begründung der Unersetzlichkeit sei möglich, wäre jedoch eine eigene, weiterreichende These. Dafür genügt es nicht, die Stärke der christlichen Lösung zu zeigen; konkurrierende Argumente müssten untersucht werden. [II, „Eschatologische Subjekthaftigkeit“, §§11–12.]</w:t>
       </w:r>
     </w:p>
     <w:p>
@@ -1286,10 +1271,7 @@
     </w:p>
     <w:p>
       <w:r>
-        <w:rPr>
-          <w:b w:val="0"/>
-        </w:rPr>
-        <w:t>Das Kreuz nimmt in CTM eine zentrale Stellung ein, weil es die Treue zur Wahrheit von der Garantie des eigenen Erfolgs trennt. Gilt nur das als wahr, was meine Macht, mein Ansehen und meine Sicherheit erhält, bleibe ich selbst der letzte Grund. Die Praxis des Kreuzes bezeichnet die Möglichkeit, auf diese Bedingung zu verzichten.</w:t>
+        <w:t>Das Kreuz nimmt in CTM eine zentrale Stellung ein, weil es die Treue zur Wahrheit von der Garantie des eigenen Erfolgs trennt. Hält ein Mensch nur das für wahr, was seine Macht, sein Ansehen und seine Sicherheit erhält, betrachtet er weiterhin sich selbst als letzten Grund. Die Praxis des Kreuzes bezeichnet die Möglichkeit, auf diese Bedingung zu verzichten.</w:t>
       </w:r>
     </w:p>
     <w:p>
@@ -1474,10 +1456,7 @@
     </w:p>
     <w:p>
       <w:r>
-        <w:rPr>
-          <w:b w:val="0"/>
-        </w:rPr>
-        <w:t>Ontologische Kommunikation beginnt dort, wo der andere mir nicht nur Informationen mitteilen, sondern die Grundlagen meines Verständnisses verändern kann. Ich erkenne an, dass er nicht als Figur meines Weltbildes existiert. Seine Antwort kann etwas aufdecken, das meine Karte nicht umfasst.</w:t>
+        <w:t>Ontologische Kommunikation beginnt dort, wo die Begegnung mit dem anderen nicht nur neue Informationen vermittelt, sondern auch die Grundlagen des eigenen Verständnisses verändern kann. Dazu muss die eigenständige Wirklichkeit des Gegenübers anerkannt werden, die sich nicht auf dessen Platz im eigenen Weltbild reduzieren lässt. Die Antwort des anderen kann etwas aufdecken, das diese Karte nicht umfasst.</w:t>
       </w:r>
     </w:p>
     <w:p>
@@ -1554,10 +1533,7 @@
     </w:p>
     <w:p>
       <w:r>
-        <w:rPr>
-          <w:b w:val="0"/>
-        </w:rPr>
-        <w:t>Darin besteht die radikalste ekklesiologische Frage von CTM: Bringt das kirchliche Leben Menschen hervor, die Gott selbst antworten können? Ihre Radikalität verlangt keine Verneinung der Institution. Vielmehr verlangt sie von der Institution, ihre Treue zu der Bestimmung zu zeigen, um derentwillen sie besteht.</w:t>
+        <w:t>Eine der zentralen ekklesiologischen Fragen von CTM lässt sich daher so formulieren: Bringt das kirchliche Leben Menschen hervor, die Gott selbst antworten können? Diese Fragestellung verlangt keine Verneinung der Institution. Sie verlangt von der Institution, ihre Treue zu der Bestimmung zu zeigen, um derentwillen sie besteht.</w:t>
       </w:r>
     </w:p>
     <w:p>
@@ -2198,10 +2174,7 @@
     </w:p>
     <w:p>
       <w:r>
-        <w:rPr>
-          <w:b w:val="0"/>
-        </w:rPr>
-        <w:t>Der stärkste Einwand besteht nicht in der Verneinung jeder Wirklichkeit. Er lautet: Warum kann die Anerkennung fehlbarer Karten nicht mit begrenzten, revidierbaren Kriterien ohne einen einzigen maximalen Grund vereinbar sein? Die Antwort von CTM verweist auf den Regress der Kriterien und die Gefahr, etwas Partielles zu verabsolutieren. Um die Auseinandersetzung zu entscheiden, muss gezeigt werden, warum dieser Regress gerade einen persönlichen Grund erfordert und wie die menschliche Hinwendung zu ihm vermeidet, das eigene Gottesbild in eine weitere, vor Prüfung geschützte Karte zu verwandeln.</w:t>
+        <w:t>Ein wesentlicher Einwand besteht nicht in der Verneinung jeder Wirklichkeit. Er lautet: Warum kann die Anerkennung fehlbarer Karten nicht mit begrenzten, revidierbaren Kriterien ohne einen einzigen maximalen Grund vereinbar sein? Die Antwort von CTM verweist auf den Regress der Kriterien und die Gefahr, etwas Partielles zu verabsolutieren. Um die Auseinandersetzung zu entscheiden, muss gezeigt werden, warum dieser Regress gerade einen persönlichen Grund erfordert und wie die menschliche Hinwendung zu ihm vermeidet, das eigene Gottesbild in eine weitere, vor Prüfung geschützte Karte zu verwandeln.</w:t>
       </w:r>
     </w:p>
     <w:p>
@@ -2578,10 +2551,7 @@
     </w:p>
     <w:p>
       <w:r>
-        <w:rPr>
-          <w:b w:val="0"/>
-        </w:rPr>
-        <w:t>Die knappste gehaltvolle Rekonstruktion von CTM lautet: Der Mensch empfängt sein Sein, ist aber berufen, selbst zu antworten; eine eigene Antwort verlangt die Unterscheidung zwischen Realität und eigener Karte, die Übernahme der Folgen und Offenheit für Korrektur; das Christentum erschließt den letzten Grund dieser Antwort im dreieinigen Gott und ihre Bestimmung in ewiger Gemeinschaft; geschichtliche Formen sind danach zu beurteilen, ob sie eine solche Antwort ermöglichen.</w:t>
+        <w:t>Die zentrale These von CTM lässt sich wie folgt rekonstruieren: Der Mensch empfängt sein Sein, ist aber berufen, selbst zu antworten; eine eigene Antwort verlangt die Unterscheidung zwischen Realität und eigener Karte, die Übernahme der Folgen und Offenheit für Korrektur; das Christentum erschließt den letzten Grund dieser Antwort im dreieinigen Gott und ihre Bestimmung in ewiger Gemeinschaft; geschichtliche Formen sind danach zu beurteilen, ob sie eine solche Antwort ermöglichen.</w:t>
       </w:r>
     </w:p>
     <w:p>

</xml_diff>

<commit_message>
Use approved German project abbreviation CDJ in German pages and analysis downloads
</commit_message>
<xml_diff>
--- a/docs/exposition/downloads/CTM_analysis_de.docx
+++ b/docs/exposition/downloads/CTM_analysis_de.docx
@@ -7,7 +7,7 @@
         <w:pStyle w:val="Title"/>
       </w:pPr>
       <w:r>
-        <w:t>Philosophie und Theologie des CTM-Projekts</w:t>
+        <w:t>Philosophie und Theologie des CDJ-Projekts</w:t>
       </w:r>
     </w:p>
     <w:p>
@@ -257,7 +257,7 @@
           <w:rPr>
             <w:sz w:val="21"/>
           </w:rPr>
-          <w:t>16 Methodologie der CTM-Analyse</w:t>
+          <w:t>16 Methodologie der CDJ-Analyse</w:t>
         </w:r>
       </w:hyperlink>
     </w:p>
@@ -359,15 +359,15 @@
         <w:rPr>
           <w:b w:val="0"/>
         </w:rPr>
-        <w:t>CTM untersucht, wie der Mensch zum wirklichen Urheber seines Lebens werden kann, obwohl er weder sich selbst noch die Welt noch die Sprache geschaffen hat, in der er sein Dasein versteht. Die christliche Antwort des Projekts lautet: Der empfangene Charakter des Seins schließt eine eigene Antwort nicht aus. Vielmehr kann die Beziehung zu Gott menschliche Autorschaft ermöglichen und tragfähig machen, ohne den Menschen zu einem souveränen Urgrund zu erheben.</w:t>
-      </w:r>
-    </w:p>
-    <w:p>
-      <w:r>
-        <w:rPr>
-          <w:b w:val="0"/>
-        </w:rPr>
-        <w:t>Aus dieser Frage entsteht ein umfassendes Forschungsprogramm. Zunächst fragt CTM, was die Kirche für die Bildung des Menschen leisten soll. Dann untersucht es, wie überhaupt ein Subjekt entsteht, wie seine Wahrnehmung der Wirklichkeit beschaffen ist und warum es sich nicht nur in einzelnen Urteilen, sondern auch in den Grundlagen seines Lebens irren kann. Schließlich entwickelt das Projekt eine Methode zur Analyse von Institutionen und Kollektiven: Wem ermöglichen sie, zu sehen, anzufangen, zu widersprechen, Entscheidungen zu korrigieren und für die Folgen einzustehen?</w:t>
+        <w:t>CDJ untersucht, wie der Mensch zum wirklichen Urheber seines Lebens werden kann, obwohl er weder sich selbst noch die Welt noch die Sprache geschaffen hat, in der er sein Dasein versteht. Die christliche Antwort des Projekts lautet: Der empfangene Charakter des Seins schließt eine eigene Antwort nicht aus. Vielmehr kann die Beziehung zu Gott menschliche Autorschaft ermöglichen und tragfähig machen, ohne den Menschen zu einem souveränen Urgrund zu erheben.</w:t>
+      </w:r>
+    </w:p>
+    <w:p>
+      <w:r>
+        <w:rPr>
+          <w:b w:val="0"/>
+        </w:rPr>
+        <w:t>Aus dieser Frage entsteht ein umfassendes Forschungsprogramm. Zunächst fragt CDJ, was die Kirche für die Bildung des Menschen leisten soll. Dann untersucht es, wie überhaupt ein Subjekt entsteht, wie seine Wahrnehmung der Wirklichkeit beschaffen ist und warum es sich nicht nur in einzelnen Urteilen, sondern auch in den Grundlagen seines Lebens irren kann. Schließlich entwickelt das Projekt eine Methode zur Analyse von Institutionen und Kollektiven: Wem ermöglichen sie, zu sehen, anzufangen, zu widersprechen, Entscheidungen zu korrigieren und für die Folgen einzustehen?</w:t>
       </w:r>
     </w:p>
     <w:p>
@@ -388,7 +388,7 @@
         <w:rPr>
           <w:b w:val="0"/>
         </w:rPr>
-        <w:t>Die folgende Darstellung führt von der ursprünglichen Einsicht zum philosophischen Begriffsapparat, dann zur Theologie, zur gesellschaftlichen Problematik und zur Methodologie. Der kritische Teil prüft konkrete Argumente und unterscheidet dabei zwischen dem, was der Autor behauptet, und dem Grad seiner Begründung. Kurze Verweise in eckigen Klammern beziehen sich auf die am Ende aufgeführten Bände und Abschnitte. Die erläuternden Beispiele stammen aus dieser Analyse; sie werden nicht als vom Autor des CTM-Projekts untersuchte Fälle ausgegeben.</w:t>
+        <w:t>Die folgende Darstellung führt von der ursprünglichen Einsicht zum philosophischen Begriffsapparat, dann zur Theologie, zur gesellschaftlichen Problematik und zur Methodologie. Der kritische Teil prüft konkrete Argumente und unterscheidet dabei zwischen dem, was der Autor behauptet, und dem Grad seiner Begründung. Kurze Verweise in eckigen Klammern beziehen sich auf die am Ende aufgeführten Bände und Abschnitte. Die erläuternden Beispiele stammen aus dieser Analyse; sie werden nicht als vom Autor des CDJ-Projekts untersuchte Fälle ausgegeben.</w:t>
       </w:r>
     </w:p>
     <w:p>
@@ -414,7 +414,7 @@
         <w:rPr>
           <w:b w:val="0"/>
         </w:rPr>
-        <w:t>Die Ausgangsdiagnose von CTM besagt nicht lediglich, dass Christen unzureichend moralisch oder kirchliche Einrichtungen schlecht organisiert seien. Das Problem reicht tiefer: Das Christentum kann Riten, dogmatische Formeln und öffentliche Sichtbarkeit bewahren, aber aufhören, jene Welt zu bestimmen, innerhalb deren der Mensch seine Entscheidungen trifft. Dann sagt ihm die politische Ideologie, wer sein Feind ist; der Markt, was als Erfolg gilt; das psychische Wohlbefinden, was er vermeiden soll; das vertraute Milieu, wonach er nicht fragen darf. Das Christentum nimmt den verbleibenden Platz ein und heiligt eine bereits vorgegebene Bahn.</w:t>
+        <w:t>Die Ausgangsdiagnose von CDJ besagt nicht lediglich, dass Christen unzureichend moralisch oder kirchliche Einrichtungen schlecht organisiert seien. Das Problem reicht tiefer: Das Christentum kann Riten, dogmatische Formeln und öffentliche Sichtbarkeit bewahren, aber aufhören, jene Welt zu bestimmen, innerhalb deren der Mensch seine Entscheidungen trifft. Dann sagt ihm die politische Ideologie, wer sein Feind ist; der Markt, was als Erfolg gilt; das psychische Wohlbefinden, was er vermeiden soll; das vertraute Milieu, wonach er nicht fragen darf. Das Christentum nimmt den verbleibenden Platz ein und heiligt eine bereits vorgegebene Bahn.</w:t>
       </w:r>
     </w:p>
     <w:p>
@@ -430,7 +430,7 @@
         <w:rPr>
           <w:b w:val="0"/>
         </w:rPr>
-        <w:t>CTM verbindet diesen Anspruch mit der Fülle des Menschseins. Christus kommt nicht, um den Menschen als gehorsames Element einer bereits bestehenden Ordnung festzuschreiben. Die Beziehung zu Christus soll seine Fähigkeit verändern, zu sehen, zu verstehen, zu kommunizieren, zu handeln und sich angesichts des Todes zu bewahren. Daher betrachtet das Projekt den Glauben als Seinsweise und das kirchliche Leben als Raum ihrer Bildung. [I, Einleitung zu „Ein Essay zur angewandten Metaphysik des Subjekts“; „Die Ausgangsposition. Einst die ursprüngliche“; „Das Funktionsgefüge der Kirche“.]</w:t>
+        <w:t>CDJ verbindet diesen Anspruch mit der Fülle des Menschseins. Christus kommt nicht, um den Menschen als gehorsames Element einer bereits bestehenden Ordnung festzuschreiben. Die Beziehung zu Christus soll seine Fähigkeit verändern, zu sehen, zu verstehen, zu kommunizieren, zu handeln und sich angesichts des Todes zu bewahren. Daher betrachtet das Projekt den Glauben als Seinsweise und das kirchliche Leben als Raum ihrer Bildung. [I, Einleitung zu „Ein Essay zur angewandten Metaphysik des Subjekts“; „Die Ausgangsposition. Einst die ursprüngliche“; „Das Funktionsgefüge der Kirche“.]</w:t>
       </w:r>
     </w:p>
     <w:p>
@@ -446,7 +446,7 @@
         <w:rPr>
           <w:b w:val="0"/>
         </w:rPr>
-        <w:t>Man könnte CTM irrtümlich als Vorschlag lesen, die Kirche nach Unternehmensmaßstäben zu beurteilen: Wie viele Menschen kamen, wie viele Leistungen wurden erbracht, wie zufrieden sind die Beteiligten? Der Autor stellt eine andere Frage. Wenn Gott, der Logos, als das eigentlich handelnde Gegenüber in den kirchlichen Sakramenten bekannt wird, was bedeutet dies für das menschliche Leben? Wie verhält sich die Teilnahme am Sakrament zur Entwicklung der Logosnatur des Menschen?</w:t>
+        <w:t>Man könnte CDJ irrtümlich als Vorschlag lesen, die Kirche nach Unternehmensmaßstäben zu beurteilen: Wie viele Menschen kamen, wie viele Leistungen wurden erbracht, wie zufrieden sind die Beteiligten? Der Autor stellt eine andere Frage. Wenn Gott, der Logos, als das eigentlich handelnde Gegenüber in den kirchlichen Sakramenten bekannt wird, was bedeutet dies für das menschliche Leben? Wie verhält sich die Teilnahme am Sakrament zur Entwicklung der Logosnatur des Menschen?</w:t>
       </w:r>
     </w:p>
     <w:p>
@@ -488,7 +488,7 @@
         <w:rPr>
           <w:b w:val="0"/>
         </w:rPr>
-        <w:t>Die erste philosophische These von CTM lautet: Der Mensch findet sich in einer bereits bestehenden Wirklichkeit vor. Sein Leib, seine Geschichte, seine Beziehungen, seine Sprache und seine Möglichkeiten sind nicht ursprünglich sein eigenes Werk. Er tritt in eine Welt ein, die seinen Wünschen widersteht und seine Vorstellungen widerlegen kann. Darin besteht der grundlegende Realismus des Projekts.</w:t>
+        <w:t>Die erste philosophische These von CDJ lautet: Der Mensch findet sich in einer bereits bestehenden Wirklichkeit vor. Sein Leib, seine Geschichte, seine Beziehungen, seine Sprache und seine Möglichkeiten sind nicht ursprünglich sein eigenes Werk. Er tritt in eine Welt ein, die seinen Wünschen widersteht und seine Vorstellungen widerlegen kann. Darin besteht der grundlegende Realismus des Projekts.</w:t>
       </w:r>
     </w:p>
     <w:p>
@@ -504,7 +504,7 @@
         <w:rPr>
           <w:b w:val="0"/>
         </w:rPr>
-        <w:t>Deshalb unterscheidet CTM zwischen Realität und Karte. Die Karte ist notwendig: Ohne Auswahl, Unterscheidung und Verknüpfung ist sinnvolles Handeln unmöglich. Gefährlich wird es, wenn die Karte sich zur endgültigen Gesamtheit erklärt und keine Informationen über ihre eigenen Grenzen mehr annimmt. Dann wird Irrtum zur Lebensweise. Der Mensch verteidigt nicht ein einzelnes falsches Urteil, sondern eine Weltordnung, die ihm erlaubt, derjenige zu bleiben, für den er sich hält. [I, „Essay …“, Kap.1; III, Abschnitt II.]</w:t>
+        <w:t>Deshalb unterscheidet CDJ zwischen Realität und Karte. Die Karte ist notwendig: Ohne Auswahl, Unterscheidung und Verknüpfung ist sinnvolles Handeln unmöglich. Gefährlich wird es, wenn die Karte sich zur endgültigen Gesamtheit erklärt und keine Informationen über ihre eigenen Grenzen mehr annimmt. Dann wird Irrtum zur Lebensweise. Der Mensch verteidigt nicht ein einzelnes falsches Urteil, sondern eine Weltordnung, die ihm erlaubt, derjenige zu bleiben, für den er sich hält. [I, „Essay …“, Kap.1; III, Abschnitt II.]</w:t>
       </w:r>
     </w:p>
     <w:p>
@@ -525,7 +525,7 @@
     </w:p>
     <w:p>
       <w:r>
-        <w:t>Dies erweitert die Wahrheitsfrage, hebt die Genauigkeit von Aussagen aber nicht auf. Sind die Tatsachen falsch, kann die Bereitschaft, „nach der Wahrheit“ zu leben, lediglich die konsequente Befolgung eines Irrtums bedeuten. In der hier vorgeschlagenen Interpretation verbindet CTM deshalb die Überprüfbarkeit von Urteilen mit der existenziellen Bereitschaft, ihre Folgen anzunehmen. Im III. Band wird diese Verbindung durch die Forderung geschützt, Tatsache, Interpretation, Norm, Projekt und Prognose zu unterscheiden.</w:t>
+        <w:t>Dies erweitert die Wahrheitsfrage, hebt die Genauigkeit von Aussagen aber nicht auf. Sind die Tatsachen falsch, kann die Bereitschaft, „nach der Wahrheit“ zu leben, lediglich die konsequente Befolgung eines Irrtums bedeuten. In der hier vorgeschlagenen Interpretation verbindet CDJ deshalb die Überprüfbarkeit von Urteilen mit der existenziellen Bereitschaft, ihre Folgen anzunehmen. Im III. Band wird diese Verbindung durch die Forderung geschützt, Tatsache, Interpretation, Norm, Projekt und Prognose zu unterscheiden.</w:t>
       </w:r>
     </w:p>
     <w:p>
@@ -549,7 +549,7 @@
         <w:rPr>
           <w:b w:val="0"/>
         </w:rPr>
-        <w:t>In der Sprache von CTM legt Metaphysik die letzten Voraussetzungen fest: Was ist letztlich wirklich, woher kommt Sinn, worauf gründet die Verbindlichkeit der Wahrheit? Die wirkende Ontologie zeigt, wie diese Voraussetzungen in der tatsächlichen Welt des Subjekts Gestalt annehmen: Was unterscheidet es, welche Handlungen kann es vollziehen, wem kommt die Initiative zu?</w:t>
+        <w:t>In der Sprache von CDJ legt Metaphysik die letzten Voraussetzungen fest: Was ist letztlich wirklich, woher kommt Sinn, worauf gründet die Verbindlichkeit der Wahrheit? Die wirkende Ontologie zeigt, wie diese Voraussetzungen in der tatsächlichen Welt des Subjekts Gestalt annehmen: Was unterscheidet es, welche Handlungen kann es vollziehen, wem kommt die Initiative zu?</w:t>
       </w:r>
     </w:p>
     <w:p>
@@ -623,7 +623,7 @@
         <w:rPr>
           <w:b w:val="0"/>
         </w:rPr>
-        <w:t>Das übliche Freiheitsmodell beginnt mit einem Menü von Möglichkeiten: Der Mensch ist frei, wenn er zwischen A und B wählen kann. CTM richtet die Aufmerksamkeit auf die Herkunft dieses Menüs. Wer hat bestimmt, dass nur A und B möglich sind? Wer hat andere Möglichkeiten ausgeschlossen? Kann der Mensch die Fragestellung verändern?</w:t>
+        <w:t>Das übliche Freiheitsmodell beginnt mit einem Menü von Möglichkeiten: Der Mensch ist frei, wenn er zwischen A und B wählen kann. CDJ richtet die Aufmerksamkeit auf die Herkunft dieses Menüs. Wer hat bestimmt, dass nur A und B möglich sind? Wer hat andere Möglichkeiten ausgeschlossen? Kann der Mensch die Fragestellung verändern?</w:t>
       </w:r>
     </w:p>
     <w:p>
@@ -697,7 +697,7 @@
         <w:rPr>
           <w:b w:val="0"/>
         </w:rPr>
-        <w:t>Diese Phase kann nicht durch den äußeren Befehl „Verzichte auf dich selbst“ ersetzt werden. Wenn ein Mensch noch nicht selbst antworten kann, kann der Verzicht auf Selbstständigkeit seine Abhängigkeit von einem anderen Menschen oder einer Institution festigen. Gerade deshalb unterscheidet CTM nachdrücklich zwischen christlicher Umadressierung und totalitärer Unterwerfung.</w:t>
+        <w:t>Diese Phase kann nicht durch den äußeren Befehl „Verzichte auf dich selbst“ ersetzt werden. Wenn ein Mensch noch nicht selbst antworten kann, kann der Verzicht auf Selbstständigkeit seine Abhängigkeit von einem anderen Menschen oder einer Institution festigen. Gerade deshalb unterscheidet CDJ nachdrücklich zwischen christlicher Umadressierung und totalitärer Unterwerfung.</w:t>
       </w:r>
     </w:p>
     <w:p>
@@ -729,7 +729,7 @@
         <w:rPr>
           <w:b w:val="0"/>
         </w:rPr>
-        <w:t>Diese Überlegung besitzt einen starken Kern: Praktische Selbstständigkeit ist nicht gleich metaphysische Selbstgenügsamkeit. Aus der Abhängigkeit von Bedingungen folgt nicht, dass der Mensch nicht handelt; aus der Wirklichkeit seines Handelns folgt nicht, dass er von nichts abhängig ist. CTM versucht, beide Seiten zugleich festzuhalten.</w:t>
+        <w:t>Diese Überlegung besitzt einen starken Kern: Praktische Selbstständigkeit ist nicht gleich metaphysische Selbstgenügsamkeit. Aus der Abhängigkeit von Bedingungen folgt nicht, dass der Mensch nicht handelt; aus der Wirklichkeit seines Handelns folgt nicht, dass er von nichts abhängig ist. CDJ versucht, beide Seiten zugleich festzuhalten.</w:t>
       </w:r>
     </w:p>
     <w:p>
@@ -827,7 +827,7 @@
         <w:rPr>
           <w:b w:val="0"/>
         </w:rPr>
-        <w:t>Das OS ist die Gesamtheit der Weisen des Umgangs mit der Wirklichkeit. CTM unterscheidet einen rezeptiv-interpretativen, einen projektiv-ausführenden und einen reflexiv-korrigierenden Funktionskreis: wie das Subjekt Informationen aufnimmt und versteht; wie es Handlungen entwirft und ausführt; wie es Folgen bewertet und sich selbst korrigiert.</w:t>
+        <w:t>Das OS ist die Gesamtheit der Weisen des Umgangs mit der Wirklichkeit. CDJ unterscheidet einen rezeptiv-interpretativen, einen projektiv-ausführenden und einen reflexiv-korrigierenden Funktionskreis: wie das Subjekt Informationen aufnimmt und versteht; wie es Handlungen entwirft und ausführt; wie es Folgen bewertet und sich selbst korrigiert.</w:t>
       </w:r>
     </w:p>
     <w:p>
@@ -994,7 +994,7 @@
         <w:rPr>
           <w:b w:val="0"/>
         </w:rPr>
-        <w:t>CTM unterscheidet ontologische Kompetenz und sozio-ontische Projektualität. Die erste ermöglicht es, die Gründe, Grenzen und den menschlichen Sinn eines Projekts zu erkennen. Die zweite besteht darin, Organisation, Recht sowie wirtschaftliche und administrative Formen zu schaffen, durch die das Projekt in die Geschichte eintritt.</w:t>
+        <w:t>CDJ unterscheidet ontologische Kompetenz und sozio-ontische Projektualität. Die erste ermöglicht es, die Gründe, Grenzen und den menschlichen Sinn eines Projekts zu erkennen. Die zweite besteht darin, Organisation, Recht sowie wirtschaftliche und administrative Formen zu schaffen, durch die das Projekt in die Geschichte eintritt.</w:t>
       </w:r>
     </w:p>
     <w:p>
@@ -1036,7 +1036,7 @@
         <w:rPr>
           <w:b w:val="0"/>
         </w:rPr>
-        <w:t>CTM unterscheidet zwischen dem Bestehen einer Verbindung und sinnvoller Begegnung. Menschen können fortwährend Nachrichten austauschen, Handel treiben und Rollen erfüllen, ohne einander als eigenständige Träger einer Antwort anzuerkennen. Verbundenheit allein lässt Manipulation und Herrschaft zu.</w:t>
+        <w:t>CDJ unterscheidet zwischen dem Bestehen einer Verbindung und sinnvoller Begegnung. Menschen können fortwährend Nachrichten austauschen, Handel treiben und Rollen erfüllen, ohne einander als eigenständige Träger einer Antwort anzuerkennen. Verbundenheit allein lässt Manipulation und Herrschaft zu.</w:t>
       </w:r>
     </w:p>
     <w:p>
@@ -1068,7 +1068,7 @@
         <w:rPr>
           <w:b w:val="0"/>
         </w:rPr>
-        <w:t>Der Mensch hat viele reale Bindungen und Pflichten: Familie, Beruf, Volk, Staat, den eigenen Leib. CTM verlangt nicht deren Abschaffung. Methodologischer Monotheismus bedeutet, dass partielle Gründe ihren Platz und ihr Maß in Bezug auf den maximalen Grund erhalten müssen. Keiner von ihnen darf ungeprüft den ganzen Menschen beanspruchen.</w:t>
+        <w:t>Der Mensch hat viele reale Bindungen und Pflichten: Familie, Beruf, Volk, Staat, den eigenen Leib. CDJ verlangt nicht deren Abschaffung. Methodologischer Monotheismus bedeutet, dass partielle Gründe ihren Platz und ihr Maß in Bezug auf den maximalen Grund erhalten müssen. Keiner von ihnen darf ungeprüft den ganzen Menschen beanspruchen.</w:t>
       </w:r>
     </w:p>
     <w:p>
@@ -1100,7 +1100,7 @@
         <w:rPr>
           <w:b w:val="0"/>
         </w:rPr>
-        <w:t>Ein Götze ist in CTM nicht nur ein Kultbild. Götzendienst entsteht, wenn ein endlicher Gegenstand, ein Modell oder eine Institution den Status endgültiger Realität erhält. Der Mensch beginnt, ihn vor jeder Prüfung zu schützen und andere Menschen ihm unterzuordnen.</w:t>
+        <w:t>Ein Götze ist in CDJ nicht nur ein Kultbild. Götzendienst entsteht, wenn ein endlicher Gegenstand, ein Modell oder eine Institution den Status endgültiger Realität erhält. Der Mensch beginnt, ihn vor jeder Prüfung zu schützen und andere Menschen ihm unterzuordnen.</w:t>
       </w:r>
     </w:p>
     <w:p>
@@ -1142,7 +1142,7 @@
         <w:rPr>
           <w:b w:val="0"/>
         </w:rPr>
-        <w:t>Die biografische Einmaligkeit eines Menschen erschließt für sich genommen noch nicht, was CTM in der Person sucht. Auch eine Kombination von Ursachen kann einmalig sein. Das Projekt fragt nach etwas anderem: Warum hat gerade dieser Mensch ein Recht auf seine eigene Antwort und kann nicht durch einen funktional gleichwertigen Ausführenden ersetzt werden?</w:t>
+        <w:t>Die biografische Einmaligkeit eines Menschen erschließt für sich genommen noch nicht, was CDJ in der Person sucht. Auch eine Kombination von Ursachen kann einmalig sein. Das Projekt fragt nach etwas anderem: Warum hat gerade dieser Mensch ein Recht auf seine eigene Antwort und kann nicht durch einen funktional gleichwertigen Ausführenden ersetzt werden?</w:t>
       </w:r>
     </w:p>
     <w:p>
@@ -1158,7 +1158,7 @@
         <w:rPr>
           <w:b w:val="0"/>
         </w:rPr>
-        <w:t>Menschliches Werden erschafft Würde nicht aus dem Nichts und macht einen weniger kompetenten Menschen nicht weniger der Fürsorge würdig. Eine der wichtigsten Folgerungen aus dem eschatologischen Teil von CTM lautet: Der Wert einer konkreten Person lässt sich nicht an ihrer gegenwärtigen Produktivität messen. Die Berufung zur Gemeinschaft mit Gott geht der Bewertung des tatsächlichen Gelingens ihrer Antwort voraus. Dies ist besonders wichtig für das Verständnis eines Kindes, eines Kranken, eines abhängigen Menschen oder eines Menschen mit Behinderung. Diese Anwendung ist eine Folgerung der vorliegenden Analyse aus der Unterscheidung zwischen Gabe und Aktualisierung, keine eigens ausgearbeitete Theorie im Korpus. [III, §11; „Auf der Suche nach einer Pneumatologie“, §2; II, „Eschatologische Subjekthaftigkeit“, §§11–14.]</w:t>
+        <w:t>Menschliches Werden erschafft Würde nicht aus dem Nichts und macht einen weniger kompetenten Menschen nicht weniger der Fürsorge würdig. Eine der wichtigsten Folgerungen aus dem eschatologischen Teil von CDJ lautet: Der Wert einer konkreten Person lässt sich nicht an ihrer gegenwärtigen Produktivität messen. Die Berufung zur Gemeinschaft mit Gott geht der Bewertung des tatsächlichen Gelingens ihrer Antwort voraus. Dies ist besonders wichtig für das Verständnis eines Kindes, eines Kranken, eines abhängigen Menschen oder eines Menschen mit Behinderung. Diese Anwendung ist eine Folgerung der vorliegenden Analyse aus der Unterscheidung zwischen Gabe und Aktualisierung, keine eigens ausgearbeitete Theorie im Korpus. [III, §11; „Auf der Suche nach einer Pneumatologie“, §2; II, „Eschatologische Subjekthaftigkeit“, §§11–14.]</w:t>
       </w:r>
     </w:p>
     <w:p>
@@ -1174,7 +1174,7 @@
         <w:rPr>
           <w:b w:val="0"/>
         </w:rPr>
-        <w:t>Vergöttlichung bedeutet in der Logik von CTM Teilhabe am Leben Gottes unter Wahrung des Unterschieds zwischen Schöpfer und Geschöpf. Der Mensch wird nicht zum Ursprung seiner selbst und verschwindet nicht in einem unpersönlichen Ganzen. Vielmehr verlangt die Fülle der Gemeinschaft die Bewahrung dessen, der in Gemeinschaft tritt.</w:t>
+        <w:t>Vergöttlichung bedeutet in der Logik von CDJ Teilhabe am Leben Gottes unter Wahrung des Unterschieds zwischen Schöpfer und Geschöpf. Der Mensch wird nicht zum Ursprung seiner selbst und verschwindet nicht in einem unpersönlichen Ganzen. Vielmehr verlangt die Fülle der Gemeinschaft die Bewahrung dessen, der in Gemeinschaft tritt.</w:t>
       </w:r>
     </w:p>
     <w:p>
@@ -1216,7 +1216,7 @@
     </w:p>
     <w:p>
       <w:r>
-        <w:t>Im Rahmen seiner christlichen Voraussetzungen bietet CTM hier eine theologische Begründung der Unersetzlichkeit. Die Behauptung, keine andere philosophische Begründung der Unersetzlichkeit sei möglich, wäre jedoch eine eigene, weiterreichende These. Dafür genügt es nicht, die Stärke der christlichen Lösung zu zeigen; konkurrierende Argumente müssten untersucht werden. [II, „Eschatologische Subjekthaftigkeit“, §§11–12.]</w:t>
+        <w:t>Im Rahmen seiner christlichen Voraussetzungen bietet CDJ hier eine theologische Begründung der Unersetzlichkeit. Die Behauptung, keine andere philosophische Begründung der Unersetzlichkeit sei möglich, wäre jedoch eine eigene, weiterreichende These. Dafür genügt es nicht, die Stärke der christlichen Lösung zu zeigen; konkurrierende Argumente müssten untersucht werden. [II, „Eschatologische Subjekthaftigkeit“, §§11–12.]</w:t>
       </w:r>
     </w:p>
     <w:p>
@@ -1242,7 +1242,7 @@
         <w:rPr>
           <w:b w:val="0"/>
         </w:rPr>
-        <w:t>Würde man CTM ausschließlich als Stufenleiter menschlicher Anstrengungen darstellen, entstünde eine erhebliche Verzerrung. Der Mensch prüft seine Gründe, scheitert, adressiert sein Leben um – und erreicht anscheinend aus eigener Kraft Gott. Der II. Band sagt deutlich das Gegenteil: Die Bewegung des Menschen zu Gott gründet in der vorausgehenden Bewegung Gottes zum Menschen.</w:t>
+        <w:t>Würde man CDJ ausschließlich als Stufenleiter menschlicher Anstrengungen darstellen, entstünde eine erhebliche Verzerrung. Der Mensch prüft seine Gründe, scheitert, adressiert sein Leben um – und erreicht anscheinend aus eigener Kraft Gott. Der II. Band sagt deutlich das Gegenteil: Die Bewegung des Menschen zu Gott gründet in der vorausgehenden Bewegung Gottes zum Menschen.</w:t>
       </w:r>
     </w:p>
     <w:p>
@@ -1271,7 +1271,7 @@
     </w:p>
     <w:p>
       <w:r>
-        <w:t>Das Kreuz nimmt in CTM eine zentrale Stellung ein, weil es die Treue zur Wahrheit von der Garantie des eigenen Erfolgs trennt. Hält ein Mensch nur das für wahr, was seine Macht, sein Ansehen und seine Sicherheit erhält, betrachtet er weiterhin sich selbst als letzten Grund. Die Praxis des Kreuzes bezeichnet die Möglichkeit, auf diese Bedingung zu verzichten.</w:t>
+        <w:t>Das Kreuz nimmt in CDJ eine zentrale Stellung ein, weil es die Treue zur Wahrheit von der Garantie des eigenen Erfolgs trennt. Hält ein Mensch nur das für wahr, was seine Macht, sein Ansehen und seine Sicherheit erhält, betrachtet er weiterhin sich selbst als letzten Grund. Die Praxis des Kreuzes bezeichnet die Möglichkeit, auf diese Bedingung zu verzichten.</w:t>
       </w:r>
     </w:p>
     <w:p>
@@ -1287,7 +1287,7 @@
         <w:rPr>
           <w:b w:val="0"/>
         </w:rPr>
-        <w:t>Die Praxis des Kreuzes darf deshalb nicht in die Forderung umgewandelt werden, sich ständig Gefahren auszusetzen oder einer Institution die Verfügung über fremdes Leiden zu erlauben. In den Begriffen des späteren CTM muss derjenige, der einen Preis verlangt, sein Recht auf diese Forderung begründen; freiwillige Askese ist nicht mit dem von außen verfügten Entzug von Subjekthaftigkeit identisch. Eine theologische Formel entbindet nicht von dieser Prüfung.</w:t>
+        <w:t>Die Praxis des Kreuzes darf deshalb nicht in die Forderung umgewandelt werden, sich ständig Gefahren auszusetzen oder einer Institution die Verfügung über fremdes Leiden zu erlauben. In den Begriffen des späteren CDJ muss derjenige, der einen Preis verlangt, sein Recht auf diese Forderung begründen; freiwillige Askese ist nicht mit dem von außen verfügten Entzug von Subjekthaftigkeit identisch. Eine theologische Formel entbindet nicht von dieser Prüfung.</w:t>
       </w:r>
     </w:p>
     <w:p>
@@ -1311,7 +1311,7 @@
         <w:rPr>
           <w:b w:val="0"/>
         </w:rPr>
-        <w:t>Bliebe man beim Kreuz als Redlichkeit angesichts der Niederlage stehen, entstünde eine Philosophie der Würde in der Katastrophe. Der christliche Sinn von CTM reicht weiter. Auferstehung bedeutet, dass Tod und geschichtliches Urteil nicht den endgültigen Horizont der vom Logos angenommenen menschlichen Natur bilden.</w:t>
+        <w:t>Bliebe man beim Kreuz als Redlichkeit angesichts der Niederlage stehen, entstünde eine Philosophie der Würde in der Katastrophe. Der christliche Sinn von CDJ reicht weiter. Auferstehung bedeutet, dass Tod und geschichtliches Urteil nicht den endgültigen Horizont der vom Logos angenommenen menschlichen Natur bilden.</w:t>
       </w:r>
     </w:p>
     <w:p>
@@ -1327,7 +1327,7 @@
         <w:rPr>
           <w:b w:val="0"/>
         </w:rPr>
-        <w:t>Diese Unterscheidung verhindert zwei Reduktionen. Die erste verwandelt das Christentum in heroische Psychologie: Halte alles aus, und dadurch wirst du gerettet. Die zweite verwandelt Hoffnung in eine Leugnung der Folgen: Weil Gott siegen wird, sei der menschliche Irrtum unwesentlich. CTM verlangt zugleich die Wirklichkeit des geschichtlichen Preises und die Offenheit für einen Horizont, der sich nicht in der Geschichte erschöpft.</w:t>
+        <w:t>Diese Unterscheidung verhindert zwei Reduktionen. Die erste verwandelt das Christentum in heroische Psychologie: Halte alles aus, und dadurch wirst du gerettet. Die zweite verwandelt Hoffnung in eine Leugnung der Folgen: Weil Gott siegen wird, sei der menschliche Irrtum unwesentlich. CDJ verlangt zugleich die Wirklichkeit des geschichtlichen Preises und die Offenheit für einen Horizont, der sich nicht in der Geschichte erschöpft.</w:t>
       </w:r>
     </w:p>
     <w:p>
@@ -1353,7 +1353,7 @@
         <w:rPr>
           <w:b w:val="0"/>
         </w:rPr>
-        <w:t>Der Glaube hat in CTM psychische, gesellschaftliche und intellektuelle Erscheinungsformen, erschöpft sich aber nicht in ihnen. Erlebnis, Zugehörigkeit und Überzeugung können in den unterschiedlichsten religiösen und ideologischen Systemen vorkommen. Die spezifisch christliche Frage betrifft den Ursprung des Lebens und das Verhältnis zur Zukunft.</w:t>
+        <w:t>Der Glaube hat in CDJ psychische, gesellschaftliche und intellektuelle Erscheinungsformen, erschöpft sich aber nicht in ihnen. Erlebnis, Zugehörigkeit und Überzeugung können in den unterschiedlichsten religiösen und ideologischen Systemen vorkommen. Die spezifisch christliche Frage betrifft den Ursprung des Lebens und das Verhältnis zur Zukunft.</w:t>
       </w:r>
     </w:p>
     <w:p>
@@ -1417,7 +1417,7 @@
         <w:rPr>
           <w:b w:val="0"/>
         </w:rPr>
-        <w:t>Umkehr betrifft in CTM die Grundlagen von Wahrnehmung und Handlung. Der Mensch bedauert nicht nur eine Verfehlung, sondern klärt, welches Verständnis seiner selbst und der Welt sie möglich gemacht hat. Betrachtet er einen anderen Menschen weiterhin als Mittel seiner eigenen Beruhigung, muss eine einzelne Entschuldigung die sich reproduzierende Beziehungsstruktur nicht verändern.</w:t>
+        <w:t>Umkehr betrifft in CDJ die Grundlagen von Wahrnehmung und Handlung. Der Mensch bedauert nicht nur eine Verfehlung, sondern klärt, welches Verständnis seiner selbst und der Welt sie möglich gemacht hat. Betrachtet er einen anderen Menschen weiterhin als Mittel seiner eigenen Beruhigung, muss eine einzelne Entschuldigung die sich reproduzierende Beziehungsstruktur nicht verändern.</w:t>
       </w:r>
     </w:p>
     <w:p>
@@ -1464,7 +1464,7 @@
         <w:rPr>
           <w:b w:val="0"/>
         </w:rPr>
-        <w:t>Für CTM ist dies sowohl in der Beziehung zu Gott als auch in der Beziehung zum Menschen wesentlich. Gemeinschaft lässt sich nicht auf die Intensität von Erlebnissen oder auf Übereinstimmung reduzieren. Selbst ein Konflikt kann zum Ereignis der Begegnung werden, wenn die Beteiligten ihre Gründe der Prüfung öffnen. Umgekehrt kann Einmütigkeit aus dem systematischen Ausschluss Andersdenkender entstehen.</w:t>
+        <w:t>Für CDJ ist dies sowohl in der Beziehung zu Gott als auch in der Beziehung zum Menschen wesentlich. Gemeinschaft lässt sich nicht auf die Intensität von Erlebnissen oder auf Übereinstimmung reduzieren. Selbst ein Konflikt kann zum Ereignis der Begegnung werden, wenn die Beteiligten ihre Gründe der Prüfung öffnen. Umgekehrt kann Einmütigkeit aus dem systematischen Ausschluss Andersdenkender entstehen.</w:t>
       </w:r>
     </w:p>
     <w:p>
@@ -1520,7 +1520,7 @@
         <w:rPr>
           <w:b w:val="0"/>
         </w:rPr>
-        <w:t>CTM ermöglicht eine strenge Frage an den Gehorsam: Befähigt er den Menschen zu einer umfassenderen Antwort, oder überträgt er die Autorschaft seines Lebens auf eine andere Person? Äußerlich ähnliche Handlungen können einen unterschiedlichen Sinn haben. Die freiwillige Annahme einer Disziplin kann Freiheit erweitern; die erzwungene Unterdrückung von Widerspruch kann sie einschränken.</w:t>
+        <w:t>CDJ ermöglicht eine strenge Frage an den Gehorsam: Befähigt er den Menschen zu einer umfassenderen Antwort, oder überträgt er die Autorschaft seines Lebens auf eine andere Person? Äußerlich ähnliche Handlungen können einen unterschiedlichen Sinn haben. Die freiwillige Annahme einer Disziplin kann Freiheit erweitern; die erzwungene Unterdrückung von Widerspruch kann sie einschränken.</w:t>
       </w:r>
     </w:p>
     <w:p>
@@ -1533,7 +1533,7 @@
     </w:p>
     <w:p>
       <w:r>
-        <w:t>Eine der zentralen ekklesiologischen Fragen von CTM lässt sich daher so formulieren: Bringt das kirchliche Leben Menschen hervor, die Gott selbst antworten können? Diese Fragestellung verlangt keine Verneinung der Institution. Sie verlangt von der Institution, ihre Treue zu der Bestimmung zu zeigen, um derentwillen sie besteht.</w:t>
+        <w:t>Eine der zentralen ekklesiologischen Fragen von CDJ lässt sich daher so formulieren: Bringt das kirchliche Leben Menschen hervor, die Gott selbst antworten können? Diese Fragestellung verlangt keine Verneinung der Institution. Sie verlangt von der Institution, ihre Treue zu der Bestimmung zu zeigen, um derentwillen sie besteht.</w:t>
       </w:r>
     </w:p>
     <w:p>
@@ -1567,7 +1567,7 @@
         <w:rPr>
           <w:b w:val="0"/>
         </w:rPr>
-        <w:t>Eschatologische Subjekthaftigkeit erschließt in CTM diese Struktur in Bezug auf die letzte Fülle. Sie lässt sich nicht auf eine Prognose der letzten Ereignisse reduzieren. Der Mensch kann die bestehende Ordnung von dem her beurteilen, wozu menschliches Dasein berufen ist. Daher erhält das geschichtlich Erfolgreiche nicht automatisch den Status endgültiger Wahrheit.</w:t>
+        <w:t>Eschatologische Subjekthaftigkeit erschließt in CDJ diese Struktur in Bezug auf die letzte Fülle. Sie lässt sich nicht auf eine Prognose der letzten Ereignisse reduzieren. Der Mensch kann die bestehende Ordnung von dem her beurteilen, wozu menschliches Dasein berufen ist. Daher erhält das geschichtlich Erfolgreiche nicht automatisch den Status endgültiger Wahrheit.</w:t>
       </w:r>
     </w:p>
     <w:p>
@@ -1599,7 +1599,7 @@
         <w:rPr>
           <w:b w:val="0"/>
         </w:rPr>
-        <w:t>Der gemeinsame Mangel dieser Modi ist der Verlust des Unterschieds zwischen letztem Horizont und endlicher geschichtlicher Form. CTM wahrt das Recht, entschlossen zu handeln, ohne das eigene Handeln für endgültig zu erklären. Korrigierbarkeit ist nicht Überzeugungslosigkeit; die Begrenztheit eines Projekts hebt die Pflicht zu seiner Verwirklichung nicht auf, sofern es begründet ist.</w:t>
+        <w:t>Der gemeinsame Mangel dieser Modi ist der Verlust des Unterschieds zwischen letztem Horizont und endlicher geschichtlicher Form. CDJ wahrt das Recht, entschlossen zu handeln, ohne das eigene Handeln für endgültig zu erklären. Korrigierbarkeit ist nicht Überzeugungslosigkeit; die Begrenztheit eines Projekts hebt die Pflicht zu seiner Verwirklichung nicht auf, sofern es begründet ist.</w:t>
       </w:r>
     </w:p>
     <w:p>
@@ -1623,7 +1623,7 @@
         <w:rPr>
           <w:b w:val="0"/>
         </w:rPr>
-        <w:t>Im geschichtlichen Handeln bedeutet Offenheit die Möglichkeit der Korrektur und den Verzicht auf die Sakralisierung endlicher Formen. Das endgültige Eschaton wird in CTM jedoch nicht auf ewige Unabgeschlossenheit reduziert. Es umfasst die Auferstehung des Leibes, die Verklärung der Schöpfung, das Reich Gottes und die Fülle der Gemeinschaft.</w:t>
+        <w:t>Im geschichtlichen Handeln bedeutet Offenheit die Möglichkeit der Korrektur und den Verzicht auf die Sakralisierung endlicher Formen. Das endgültige Eschaton wird in CDJ jedoch nicht auf ewige Unabgeschlossenheit reduziert. Es umfasst die Auferstehung des Leibes, die Verklärung der Schöpfung, das Reich Gottes und die Fülle der Gemeinschaft.</w:t>
       </w:r>
     </w:p>
     <w:p>
@@ -1639,7 +1639,7 @@
         <w:rPr>
           <w:b w:val="0"/>
         </w:rPr>
-        <w:t>Eine Übersicht, die alles mit dem einzigen Wort „Offenheit“ abschließt, verliert daher den positiven Gehalt christlicher Hoffnung. CTM verbindet die geschichtliche Unabgeschlossenheit menschlicher Konstruktionen mit dem Versprechen einer Fülle, die der Mensch nicht aus eigener Kraft hervorbringen kann. [II, „Eschatologische Subjekthaftigkeit“, §§11–15.]</w:t>
+        <w:t>Eine Übersicht, die alles mit dem einzigen Wort „Offenheit“ abschließt, verliert daher den positiven Gehalt christlicher Hoffnung. CDJ verbindet die geschichtliche Unabgeschlossenheit menschlicher Konstruktionen mit dem Versprechen einer Fülle, die der Mensch nicht aus eigener Kraft hervorbringen kann. [II, „Eschatologische Subjekthaftigkeit“, §§11–15.]</w:t>
       </w:r>
     </w:p>
     <w:p>
@@ -1745,7 +1745,7 @@
         <w:rPr>
           <w:b w:val="0"/>
         </w:rPr>
-        <w:t>Damit ist jedoch ein Vereinbarkeitsprinzip formuliert, keine erschöpfende Theorie der Synergie. Wie verhalten sich göttliches Handeln und menschliche Kausalität in einem konkreten freien Akt zueinander? Wo unterscheiden sich natürliche Fähigkeit, gnadenhafte Heilung und persönliche Annahme? Der Autor lässt diese Fragen offen. Man darf deshalb weder behaupten, Gnade fehle in CTM, noch die Frage als vollständig gelöst betrachten.</w:t>
+        <w:t>Damit ist jedoch ein Vereinbarkeitsprinzip formuliert, keine erschöpfende Theorie der Synergie. Wie verhalten sich göttliches Handeln und menschliche Kausalität in einem konkreten freien Akt zueinander? Wo unterscheiden sich natürliche Fähigkeit, gnadenhafte Heilung und persönliche Annahme? Der Autor lässt diese Fragen offen. Man darf deshalb weder behaupten, Gnade fehle in CDJ, noch die Frage als vollständig gelöst betrachten.</w:t>
       </w:r>
     </w:p>
     <w:p>
@@ -1851,7 +1851,7 @@
         <w:rPr>
           <w:b w:val="0"/>
         </w:rPr>
-        <w:t>In CTM entsteht Modernisierung aus der Begegnung zunehmend komplexer gesellschaftlicher Ontologien mit der sich entwickelnden Fähigkeit des Menschen, sie sich anzueignen. Wächst die gesellschaftliche Komplexität schneller als die subjekthafte Kapazität, entstehen Institutionen, die Menschen nach der Logik einer anderen Tätigkeit nutzen.</w:t>
+        <w:t>In CDJ entsteht Modernisierung aus der Begegnung zunehmend komplexer gesellschaftlicher Ontologien mit der sich entwickelnden Fähigkeit des Menschen, sie sich anzueignen. Wächst die gesellschaftliche Komplexität schneller als die subjekthafte Kapazität, entstehen Institutionen, die Menschen nach der Logik einer anderen Tätigkeit nutzen.</w:t>
       </w:r>
     </w:p>
     <w:p>
@@ -1941,7 +1941,7 @@
         <w:rPr>
           <w:b w:val="0"/>
         </w:rPr>
-        <w:t>CTM trennt mehrere Prüfungen: Besteht das Gemeinsame? Wie wird es repräsentiert? Ist das Vertrauen in seinen Vertreter begründet? Hat dieser das Recht, gerade diese Forderung zu stellen? Wie wird die Verantwortung eines konkreten Menschen verortet? Diese Trennung verhindert den Übergang von „Das ist für alle wichtig“ zu „Du musst jeden Preis zahlen“.</w:t>
+        <w:t>CDJ trennt mehrere Prüfungen: Besteht das Gemeinsame? Wie wird es repräsentiert? Ist das Vertrauen in seinen Vertreter begründet? Hat dieser das Recht, gerade diese Forderung zu stellen? Wie wird die Verantwortung eines konkreten Menschen verortet? Diese Trennung verhindert den Übergang von „Das ist für alle wichtig“ zu „Du musst jeden Preis zahlen“.</w:t>
       </w:r>
     </w:p>
     <w:p>
@@ -1998,7 +1998,7 @@
         <w:pStyle w:val="Heading1"/>
       </w:pPr>
       <w:r>
-        <w:t>16 Methodologie der CTM-Analyse</w:t>
+        <w:t>16 Methodologie der CDJ-Analyse</w:t>
       </w:r>
       <w:bookmarkEnd w:id="16"/>
     </w:p>
@@ -2015,7 +2015,7 @@
         <w:rPr>
           <w:b w:val="0"/>
         </w:rPr>
-        <w:t>CTM-Analyse wird als Vektoranalyse der Subjekthaftigkeit bestimmt. Ihr Gegenstand ist die Veränderung von Ebene, Richtung, Träger und Verteilung menschlicher Antwort. Sie fragt nicht nur, wie effektiv ein System handelt, sondern auch, welche Art von Mensch die Teilnahme an ihm hervorbringt.</w:t>
+        <w:t>CDJ-Analyse wird als Vektoranalyse der Subjekthaftigkeit bestimmt. Ihr Gegenstand ist die Veränderung von Ebene, Richtung, Träger und Verteilung menschlicher Antwort. Sie fragt nicht nur, wie effektiv ein System handelt, sondern auch, welche Art von Mensch die Teilnahme an ihm hervorbringt.</w:t>
       </w:r>
     </w:p>
     <w:p>
@@ -2079,7 +2079,7 @@
         <w:rPr>
           <w:b w:val="0"/>
         </w:rPr>
-        <w:t>Zunächst wird die Anwendbarkeit geprüft: Ist der Begriffsapparat von CTM hier überhaupt erforderlich? Zur Feststellung eines Datums oder zur Messung einer physikalischen Größe ist er meist überflüssig. Anschließend wird der Gegenstand eingegrenzt: Zeitraum, Beteiligte, Funktion und Maßstab. Einzelne Episoden dürfen nicht ohne Beleg zu einer einheitlichen Entität namens „Volk“ oder „Kirche“ verbunden werden.</w:t>
+        <w:t>Zunächst wird die Anwendbarkeit geprüft: Ist der Begriffsapparat von CDJ hier überhaupt erforderlich? Zur Feststellung eines Datums oder zur Messung einer physikalischen Größe ist er meist überflüssig. Anschließend wird der Gegenstand eingegrenzt: Zeitraum, Beteiligte, Funktion und Maßstab. Einzelne Episoden dürfen nicht ohne Beleg zu einer einheitlichen Entität namens „Volk“ oder „Kirche“ verbunden werden.</w:t>
       </w:r>
     </w:p>
     <w:p>
@@ -2127,15 +2127,15 @@
         <w:rPr>
           <w:b w:val="0"/>
         </w:rPr>
-        <w:t>Diese Forderung gilt auch für CTM selbst. Erhöhen seine Kategorien das Auflösungsvermögen der Untersuchung nicht, ist ihre Anwendung zu beenden. Die Stärke dieser Einstellung liegt in der Möglichkeit, die Methode von einer ansprechenden nachträglichen Interpretation zu trennen. Ihre tatsächliche Produktivität muss sich jedoch in Untersuchungen zeigen, in denen Alternativen das Ergebnis wirklich verändern können.</w:t>
-      </w:r>
-    </w:p>
-    <w:p>
-      <w:r>
-        <w:rPr>
-          <w:b w:val="0"/>
-        </w:rPr>
-        <w:t>CTM-Gestaltung beginnt nach der Diagnose. Sie verändert die Architektur des Möglichen: Informationskanäle, Initiativrechte, Bedingungen für Korrektur und Abbruch sowie die Verbindung der Entscheidung mit ihren Folgen. Der Appell „Seid verantwortlich“ genügt nicht, wenn die Systemstruktur Antwort systematisch unmöglich macht. [III, §§130–140.]</w:t>
+        <w:t>Diese Forderung gilt auch für CDJ selbst. Erhöhen seine Kategorien das Auflösungsvermögen der Untersuchung nicht, ist ihre Anwendung zu beenden. Die Stärke dieser Einstellung liegt in der Möglichkeit, die Methode von einer ansprechenden nachträglichen Interpretation zu trennen. Ihre tatsächliche Produktivität muss sich jedoch in Untersuchungen zeigen, in denen Alternativen das Ergebnis wirklich verändern können.</w:t>
+      </w:r>
+    </w:p>
+    <w:p>
+      <w:r>
+        <w:rPr>
+          <w:b w:val="0"/>
+        </w:rPr>
+        <w:t>CDJ-Gestaltung beginnt nach der Diagnose. Sie verändert die Architektur des Möglichen: Informationskanäle, Initiativrechte, Bedingungen für Korrektur und Abbruch sowie die Verbindung der Entscheidung mit ihren Folgen. Der Appell „Seid verantwortlich“ genügt nicht, wenn die Systemstruktur Antwort systematisch unmöglich macht. [III, §§130–140.]</w:t>
       </w:r>
     </w:p>
     <w:p>
@@ -2174,7 +2174,7 @@
     </w:p>
     <w:p>
       <w:r>
-        <w:t>Ein wesentlicher Einwand besteht nicht in der Verneinung jeder Wirklichkeit. Er lautet: Warum kann die Anerkennung fehlbarer Karten nicht mit begrenzten, revidierbaren Kriterien ohne einen einzigen maximalen Grund vereinbar sein? Die Antwort von CTM verweist auf den Regress der Kriterien und die Gefahr, etwas Partielles zu verabsolutieren. Um die Auseinandersetzung zu entscheiden, muss gezeigt werden, warum dieser Regress gerade einen persönlichen Grund erfordert und wie die menschliche Hinwendung zu ihm vermeidet, das eigene Gottesbild in eine weitere, vor Prüfung geschützte Karte zu verwandeln.</w:t>
+        <w:t>Ein wesentlicher Einwand besteht nicht in der Verneinung jeder Wirklichkeit. Er lautet: Warum kann die Anerkennung fehlbarer Karten nicht mit begrenzten, revidierbaren Kriterien ohne einen einzigen maximalen Grund vereinbar sein? Die Antwort von CDJ verweist auf den Regress der Kriterien und die Gefahr, etwas Partielles zu verabsolutieren. Um die Auseinandersetzung zu entscheiden, muss gezeigt werden, warum dieser Regress gerade einen persönlichen Grund erfordert und wie die menschliche Hinwendung zu ihm vermeidet, das eigene Gottesbild in eine weitere, vor Prüfung geschützte Karte zu verwandeln.</w:t>
       </w:r>
     </w:p>
     <w:p>
@@ -2206,7 +2206,7 @@
         <w:rPr>
           <w:b w:val="0"/>
         </w:rPr>
-        <w:t>CTM bietet eine Sprache, in der sich menschliche Antwort untersuchen lässt, ohne sie aus der Beschreibung zu tilgen. Der theologische Teil schlägt ihren Grund in Gottebenbildlichkeit und Gnade vor. Eine erschöpfende Theorie der Vereinbarkeit menschlicher Kausalität, natürlicher Bedingungen und göttlichen Handelns bleibt jedoch offen. Der Autor selbst erkennt diese Grenze im Beitrag zur Pneumatologie an.</w:t>
+        <w:t>CDJ bietet eine Sprache, in der sich menschliche Antwort untersuchen lässt, ohne sie aus der Beschreibung zu tilgen. Der theologische Teil schlägt ihren Grund in Gottebenbildlichkeit und Gnade vor. Eine erschöpfende Theorie der Vereinbarkeit menschlicher Kausalität, natürlicher Bedingungen und göttlichen Handelns bleibt jedoch offen. Der Autor selbst erkennt diese Grenze im Beitrag zur Pneumatologie an.</w:t>
       </w:r>
     </w:p>
     <w:p>
@@ -2238,7 +2238,7 @@
         <w:rPr>
           <w:b w:val="0"/>
         </w:rPr>
-        <w:t>Zudem garantiert das gemeinsame Bekenntnis zu einem gemeinsamen Grund keinen Verzicht auf Herrschaft. Das spätere CTM liefert selbst eine Antwort auf diesen Einwand: Die wirkende Architektur muss geprüft werden; eine Erklärung genügt nicht. So präzisiert die Methodologie die gesellschaftliche Anwendung der frühen metaphysischen These.</w:t>
+        <w:t>Zudem garantiert das gemeinsame Bekenntnis zu einem gemeinsamen Grund keinen Verzicht auf Herrschaft. Das spätere CDJ liefert selbst eine Antwort auf diesen Einwand: Die wirkende Architektur muss geprüft werden; eine Erklärung genügt nicht. So präzisiert die Methodologie die gesellschaftliche Anwendung der frühen metaphysischen These.</w:t>
       </w:r>
     </w:p>
     <w:p>
@@ -2296,7 +2296,7 @@
         <w:rPr>
           <w:b w:val="0"/>
         </w:rPr>
-        <w:t>CTM ist ein sich entwickelndes Korpus. Im I. Band bedeutet Subjekthaftigkeit häufig eine wahre Position, und ontisches Handeln wird ontologischem scharf gegenübergestellt. Im II. Band werden die notwendige ontische Subjekthaftigkeit eingeführt und die Stärke eines geschichtlichen Projekts von der Qualität seines Grundes unterschieden. Der III. Band verbietet ausdrücklich, aus der bloßen Fähigkeit anzufangen auf sittliche Wahrheit zu schließen.</w:t>
+        <w:t>CDJ ist ein sich entwickelndes Korpus. Im I. Band bedeutet Subjekthaftigkeit häufig eine wahre Position, und ontisches Handeln wird ontologischem scharf gegenübergestellt. Im II. Band werden die notwendige ontische Subjekthaftigkeit eingeführt und die Stärke eines geschichtlichen Projekts von der Qualität seines Grundes unterschieden. Der III. Band verbietet ausdrücklich, aus der bloßen Fähigkeit anzufangen auf sittliche Wahrheit zu schließen.</w:t>
       </w:r>
     </w:p>
     <w:p>
@@ -2344,7 +2344,7 @@
         <w:rPr>
           <w:b w:val="0"/>
         </w:rPr>
-        <w:t>Die starke These von CTM lautet, dass eine erfolgreiche Form beginnen kann, sich selbst statt ihrer Bestimmung zu reproduzieren. Daraus folgt nicht, dass jede Wiederholung schädlich wäre. Fürsorge, Bildung, liturgischer Rhythmus und ein verlässliches Verfahren können gerade durch ihre Beständigkeit Subjekthaftigkeit stützen. Das Problem beginnt, wenn Prüfung und Erneuerung ausgeschlossen werden.</w:t>
+        <w:t>Die starke These von CDJ lautet, dass eine erfolgreiche Form beginnen kann, sich selbst statt ihrer Bestimmung zu reproduzieren. Daraus folgt nicht, dass jede Wiederholung schädlich wäre. Fürsorge, Bildung, liturgischer Rhythmus und ein verlässliches Verfahren können gerade durch ihre Beständigkeit Subjekthaftigkeit stützen. Das Problem beginnt, wenn Prüfung und Erneuerung ausgeschlossen werden.</w:t>
       </w:r>
     </w:p>
     <w:p>
@@ -2376,7 +2376,7 @@
         <w:rPr>
           <w:b w:val="0"/>
         </w:rPr>
-        <w:t>Diese Einwände widerlegen die Architektur von CTM nicht. Sie trennen ihre Argumente von Veranschaulichungen, die einer eigenständigen Prüfung bedürfen. Gerade das eigene Prinzip des Projekts – keinen unbewiesenen Übergang zuzulassen – macht diese Abgrenzung notwendig.</w:t>
+        <w:t>Diese Einwände widerlegen die Architektur von CDJ nicht. Sie trennen ihre Argumente von Veranschaulichungen, die einer eigenständigen Prüfung bedürfen. Gerade das eigene Prinzip des Projekts – keinen unbewiesenen Übergang zuzulassen – macht diese Abgrenzung notwendig.</w:t>
       </w:r>
     </w:p>
     <w:p>
@@ -2450,7 +2450,7 @@
         <w:rPr>
           <w:b w:val="0"/>
         </w:rPr>
-        <w:t>CTM verbindet eine Anthropologie der Antwort, christliche Eschatologie und die Analyse wirkender Institutionen. Sein Gehalt bestimmt sich durch diese Verbindung, nicht durch die Zahl neuer Begriffe. Begriffe werden nützlich, wenn sie einen konkreten Bruch sichtbar machen: Wissen erreicht die Entscheidung nicht, Initiative wird vom Preis getrennt, kirchliche Leitung reproduziert Abhängigkeit, geschichtlicher Erfolg wird für endgültige Wahrheit gehalten.</w:t>
+        <w:t>CDJ verbindet eine Anthropologie der Antwort, christliche Eschatologie und die Analyse wirkender Institutionen. Sein Gehalt bestimmt sich durch diese Verbindung, nicht durch die Zahl neuer Begriffe. Begriffe werden nützlich, wenn sie einen konkreten Bruch sichtbar machen: Wissen erreicht die Entscheidung nicht, Initiative wird vom Preis getrennt, kirchliche Leitung reproduziert Abhängigkeit, geschichtlicher Erfolg wird für endgültige Wahrheit gehalten.</w:t>
       </w:r>
     </w:p>
     <w:p>
@@ -2474,7 +2474,7 @@
         <w:pStyle w:val="Heading2"/>
       </w:pPr>
       <w:r>
-        <w:t>Wie CTM mit anderen Philosophien verglichen werden kann</w:t>
+        <w:t>Wie CDJ mit anderen Philosophien verglichen werden kann</w:t>
       </w:r>
     </w:p>
     <w:p>
@@ -2490,7 +2490,7 @@
         <w:rPr>
           <w:b w:val="0"/>
         </w:rPr>
-        <w:t>Die Übereinstimmung von Wörtern wie „Sein“, „Entscheidung“ oder „Dialog“ beweist jedoch weder die Herkunft eines Arguments noch die Überlegenheit eines Systems über ein anderes. Wer behauptet, CTM überwinde eine Grenze Heideggers, Bubers, Barths oder einer anderen Tradition, muss die jeweiligen Texte symmetrisch rekonstruieren. Solche Vergleiche sind hier das Programm einer gesonderten Untersuchung, kein fertiges Ergebnis.</w:t>
+        <w:t>Die Übereinstimmung von Wörtern wie „Sein“, „Entscheidung“ oder „Dialog“ beweist jedoch weder die Herkunft eines Arguments noch die Überlegenheit eines Systems über ein anderes. Wer behauptet, CDJ überwinde eine Grenze Heideggers, Bubers, Barths oder einer anderen Tradition, muss die jeweiligen Texte symmetrisch rekonstruieren. Solche Vergleiche sind hier das Programm einer gesonderten Untersuchung, kein fertiges Ergebnis.</w:t>
       </w:r>
     </w:p>
     <w:p>
@@ -2522,7 +2522,7 @@
         <w:rPr>
           <w:b w:val="0"/>
         </w:rPr>
-        <w:t>Ein zweiter Test wäre der Vergleich mit einer einfacheren Erklärung. Lässt sich ein Versagen vollständig durch Ressourcenmangel erklären, muss CTM zeigen, was die Analyse der Subjektarchitektur hinzufügt. Fügt sie nichts Wesentliches hinzu, ist die Verkomplizierung des Wortschatzes nicht gerechtfertigt.</w:t>
+        <w:t>Ein zweiter Test wäre der Vergleich mit einer einfacheren Erklärung. Lässt sich ein Versagen vollständig durch Ressourcenmangel erklären, muss CDJ zeigen, was die Analyse der Subjektarchitektur hinzufügt. Fügt sie nichts Wesentliches hinzu, ist die Verkomplizierung des Wortschatzes nicht gerechtfertigt.</w:t>
       </w:r>
     </w:p>
     <w:p>
@@ -2551,15 +2551,15 @@
     </w:p>
     <w:p>
       <w:r>
-        <w:t>Die zentrale These von CTM lässt sich wie folgt rekonstruieren: Der Mensch empfängt sein Sein, ist aber berufen, selbst zu antworten; eine eigene Antwort verlangt die Unterscheidung zwischen Realität und eigener Karte, die Übernahme der Folgen und Offenheit für Korrektur; das Christentum erschließt den letzten Grund dieser Antwort im dreieinigen Gott und ihre Bestimmung in ewiger Gemeinschaft; geschichtliche Formen sind danach zu beurteilen, ob sie eine solche Antwort ermöglichen.</w:t>
-      </w:r>
-    </w:p>
-    <w:p>
-      <w:r>
-        <w:rPr>
-          <w:b w:val="0"/>
-        </w:rPr>
-        <w:t>Dies ist eine zusammenhängende und gehaltvolle Forschungsposition. Ihre Stärke verlangt nicht, sämtliche metaphysischen Übergänge bereits für bewiesen, die Theorie der Synergie für abgeschlossen oder die gesamte Methode für empirisch bestätigt zu erklären. Vielmehr setzt die eigene Forderung von CTM, der Realität das Recht zu lassen, die Karte zu verändern, einen angemessenen Maßstab für die weitere Arbeit am Projekt selbst.</w:t>
+        <w:t>Die zentrale These von CDJ lässt sich wie folgt rekonstruieren: Der Mensch empfängt sein Sein, ist aber berufen, selbst zu antworten; eine eigene Antwort verlangt die Unterscheidung zwischen Realität und eigener Karte, die Übernahme der Folgen und Offenheit für Korrektur; das Christentum erschließt den letzten Grund dieser Antwort im dreieinigen Gott und ihre Bestimmung in ewiger Gemeinschaft; geschichtliche Formen sind danach zu beurteilen, ob sie eine solche Antwort ermöglichen.</w:t>
+      </w:r>
+    </w:p>
+    <w:p>
+      <w:r>
+        <w:rPr>
+          <w:b w:val="0"/>
+        </w:rPr>
+        <w:t>Dies ist eine zusammenhängende und gehaltvolle Forschungsposition. Ihre Stärke verlangt nicht, sämtliche metaphysischen Übergänge bereits für bewiesen, die Theorie der Synergie für abgeschlossen oder die gesamte Methode für empirisch bestätigt zu erklären. Vielmehr setzt die eigene Forderung von CDJ, der Realität das Recht zu lassen, die Karte zu verändern, einen angemessenen Maßstab für die weitere Arbeit am Projekt selbst.</w:t>
       </w:r>
     </w:p>
     <w:p>
@@ -3552,7 +3552,7 @@
         <w:rPr>
           <w:b w:val="0"/>
         </w:rPr>
-        <w:t xml:space="preserve"> „An die Christen des dritten Jahrtausends. Architektur der Subjekthaftigkeit“. Russischer Text mit den Untersuchungen „Genesis der Subjekthaftigkeit“, „Qualität der Ontologie“, „Ontogenese der Subjekthaftigkeit“, „Eschatologische Subjekthaftigkeit“ und „Modernisierung: die erste praktische Anwendung von CTM“. Die Verweise beziehen sich auf die Untersuchungstitel und ihre internen Paragrafen.</w:t>
+        <w:t xml:space="preserve"> „An die Christen des dritten Jahrtausends. Architektur der Subjekthaftigkeit“. Russischer Text mit den Untersuchungen „Genesis der Subjekthaftigkeit“, „Qualität der Ontologie“, „Ontogenese der Subjekthaftigkeit“, „Eschatologische Subjekthaftigkeit“ und „Modernisierung: die erste praktische Anwendung von CDJ“. Die Verweise beziehen sich auf die Untersuchungstitel und ihre internen Paragrafen.</w:t>
       </w:r>
     </w:p>
     <w:p>
@@ -3571,7 +3571,7 @@
         <w:rPr>
           <w:b w:val="0"/>
         </w:rPr>
-        <w:t xml:space="preserve"> „An die Christen des dritten Jahrtausends. Methodologie der CTM-Analyse“. Russisches PDF mit 107 Seiten. Methodologischer Teil: wirkende Ontologie – Abschnitt II; Genesis und generativer Übergang – III; Erste, Zweite und abgeleitete Ontologien – IV; Zusammenwirken von Ontologien – V; Kommunikation und kollektive Subjekthaftigkeit – VI; das Gemeinsame, Kreditwürdigkeit und Legitimität – VII; Subjektarchitektur – VIII; Vektoranalyse – IX; Verfahren – X; Gestaltung – XI; Grenzen der Methode – XII; Rückkehr zur Frage nach der Kirche – XIII.</w:t>
+        <w:t xml:space="preserve"> „An die Christen des dritten Jahrtausends. Methodologie der CDJ-Analyse“. Russisches PDF mit 107 Seiten. Methodologischer Teil: wirkende Ontologie – Abschnitt II; Genesis und generativer Übergang – III; Erste, Zweite und abgeleitete Ontologien – IV; Zusammenwirken von Ontologien – V; Kommunikation und kollektive Subjekthaftigkeit – VI; das Gemeinsame, Kreditwürdigkeit und Legitimität – VII; Subjektarchitektur – VIII; Vektoranalyse – IX; Verfahren – X; Gestaltung – XI; Grenzen der Methode – XII; Rückkehr zur Frage nach der Kirche – XIII.</w:t>
       </w:r>
     </w:p>
     <w:p>
@@ -3609,7 +3609,7 @@
         <w:rPr>
           <w:b w:val="0"/>
         </w:rPr>
-        <w:t xml:space="preserve"> „Überblick über die Philosophie Adzhindzhals“, Fassung 4, 25 Seiten. Übernommen wurde die gelungene Abfolge der Gesamtdarstellung: Ausgangsfrage, philosophische Grundlagen, Theologie, Architektur, Methode, Kritik und Glossar. Die Zuschreibungen und inhaltlichen Schlussfolgerungen der vorliegenden Analyse stützen sich auf das russische CTM-Korpus, nicht auf die Autorität des Überblicks.</w:t>
+        <w:t xml:space="preserve"> „Überblick über die Philosophie Adzhindzhals“, Fassung 4, 25 Seiten. Übernommen wurde die gelungene Abfolge der Gesamtdarstellung: Ausgangsfrage, philosophische Grundlagen, Theologie, Architektur, Methode, Kritik und Glossar. Die Zuschreibungen und inhaltlichen Schlussfolgerungen der vorliegenden Analyse stützen sich auf das russische CDJ-Korpus, nicht auf die Autorität des Überblicks.</w:t>
       </w:r>
     </w:p>
     <w:p>
@@ -3649,6 +3649,7 @@
     </w:p>
     <w:sectPr>
       <w:footerReference w:type="default" r:id="rId9"/>
+      <w:headerReference w:type="default" r:id="rId10"/>
       <w:pgSz w:w="12240" w:h="15840"/>
       <w:pgMar w:top="1152" w:right="1296" w:bottom="1152" w:left="1296" w:header="720" w:footer="720" w:gutter="0"/>
       <w:cols w:space="720"/>
@@ -3669,6 +3670,16 @@
     <w:fldSimple w:instr="PAGE"/>
   </w:p>
 </w:ftr>
+</file>
+
+<file path=word/header1.xml><?xml version="1.0" encoding="utf-8"?>
+<w:hdr xmlns:m="http://schemas.openxmlformats.org/officeDocument/2006/math" xmlns:mc="http://schemas.openxmlformats.org/markup-compatibility/2006" xmlns:mo="http://schemas.microsoft.com/office/mac/office/2008/main" xmlns:mv="urn:schemas-microsoft-com:mac:vml" xmlns:o="urn:schemas-microsoft-com:office:office" xmlns:r="http://schemas.openxmlformats.org/officeDocument/2006/relationships" xmlns:v="urn:schemas-microsoft-com:vml" xmlns:w10="urn:schemas-microsoft-com:office:word" xmlns:w14="http://schemas.microsoft.com/office/word/2010/wordml" xmlns:w="http://schemas.openxmlformats.org/wordprocessingml/2006/main" xmlns:wne="http://schemas.microsoft.com/office/word/2006/wordml" xmlns:wp14="http://schemas.microsoft.com/office/word/2010/wordprocessingDrawing" xmlns:wp="http://schemas.openxmlformats.org/drawingml/2006/wordprocessingDrawing" xmlns:wpc="http://schemas.microsoft.com/office/word/2010/wordprocessingCanvas" xmlns:wpg="http://schemas.microsoft.com/office/word/2010/wordprocessingGroup" xmlns:wpi="http://schemas.microsoft.com/office/word/2010/wordprocessingInk" xmlns:wps="http://schemas.microsoft.com/office/word/2010/wordprocessingShape" mc:Ignorable="w14 wp14">
+  <w:p>
+    <w:pPr>
+      <w:pStyle w:val="Header"/>
+    </w:pPr>
+  </w:p>
+</w:hdr>
 </file>
 
 <file path=word/numbering.xml><?xml version="1.0" encoding="utf-8"?>

</xml_diff>

<commit_message>
Clarify grace as condition of human choice in all six exposition languages and downloads
</commit_message>
<xml_diff>
--- a/docs/exposition/downloads/CTM_analysis_de.docx
+++ b/docs/exposition/downloads/CTM_analysis_de.docx
@@ -1734,18 +1734,12 @@
     </w:p>
     <w:p>
       <w:r>
-        <w:rPr>
-          <w:b w:val="0"/>
-        </w:rPr>
-        <w:t>Das theologische Grundprinzip lautet, dass Gottes Handeln nicht als Konkurrent menschlichen Handelns gedacht werden darf. Heilt die Gnade die menschliche Natur, entsteht daraus eine vollere Fähigkeit des Menschen zu antworten, nicht das Verschwinden des Urhebers der Antwort.</w:t>
-      </w:r>
-    </w:p>
-    <w:p>
-      <w:r>
-        <w:rPr>
-          <w:b w:val="0"/>
-        </w:rPr>
-        <w:t>Damit ist jedoch ein Vereinbarkeitsprinzip formuliert, keine erschöpfende Theorie der Synergie. Wie verhalten sich göttliches Handeln und menschliche Kausalität in einem konkreten freien Akt zueinander? Wo unterscheiden sich natürliche Fähigkeit, gnadenhafte Heilung und persönliche Annahme? Der Autor lässt diese Fragen offen. Man darf deshalb weder behaupten, Gnade fehle in CDJ, noch die Frage als vollständig gelöst betrachten.</w:t>
+        <w:t>In CDJ wird die Gnade von Anfang an als Bedingung der Möglichkeit menschlicher Wahl und einer eigenen Antwort vorausgesetzt. Die „Interpretationsbedingung“ in CDJ I bezieht dies ausdrücklich auf alle Aussagen über die Wahl und die Fähigkeit des Subjekts, eine bestimmte Position einzunehmen. Menschliche Autorschaft wird daher als Vollzug einer von Gott geschenkten und geheilten Handlungsfähigkeit verstanden. Gottes Handeln darf nicht als Konkurrent menschlichen Handelns gedacht werden: Die Heilung der Natur bedeutet eine vollere Fähigkeit des Menschen zu antworten, nicht das Verschwinden des Urhebers der Antwort. [CDJ I, „Interpretationsbedingung“; CDJ III, „Auf der Suche nach einer Pneumatologie“, §14.]</w:t>
+      </w:r>
+    </w:p>
+    <w:p>
+      <w:r>
+        <w:t>Die durch Gnade ermöglichte menschliche Autorschaft bedeutet jedoch nicht, dass jede Antwort durch Gnade bestimmt ist: Der Mensch kann eine falsche, zerstörerische und sündhafte Antwort geben und trägt Verantwortung für deren Inhalt. Damit ist der Ort der Gnade als Bedingung der Möglichkeit der Antwort in CDJ bestimmt. Offen bleibt eine erschöpfende Theorie des Verhältnisses zwischen göttlichem Handeln und menschlicher Kausalität im konkreten freien Akt, einschließlich der Unterscheidung zwischen natürlicher Fähigkeit, gnadenhafter Heilung und persönlicher Annahme. Der Autor benennt diese Grenze ausdrücklich; sie hebt die bereits bestimmte Grundlage nicht auf. [CDJ III, „Auf der Suche nach einer Pneumatologie“, §§14, 18.]</w:t>
       </w:r>
     </w:p>
     <w:p>

</xml_diff>